<commit_message>
minor Update DOCX radar
</commit_message>
<xml_diff>
--- a/public/doc/emr/print_radar_dokter.docx
+++ b/public/doc/emr/print_radar_dokter.docx
@@ -24,12 +24,9 @@
         <w:gridCol w:w="423"/>
         <w:gridCol w:w="240"/>
         <w:gridCol w:w="2879"/>
-        <w:gridCol w:w="8"/>
       </w:tblGrid>
       <w:tr>
         <w:trPr>
-          <w:gridAfter w:val="1"/>
-          <w:wAfter w:w="8" w:type="dxa"/>
           <w:trHeight w:val="989"/>
         </w:trPr>
         <w:tc>
@@ -54,7 +51,7 @@
                 <w:noProof/>
               </w:rPr>
               <w:drawing>
-                <wp:anchor distT="0" distB="0" distL="114300" distR="114300" simplePos="0" relativeHeight="251659776" behindDoc="0" locked="0" layoutInCell="1" allowOverlap="1" wp14:anchorId="3EB698E0" wp14:editId="65436259">
+                <wp:anchor distT="0" distB="0" distL="114300" distR="114300" simplePos="0" relativeHeight="251658752" behindDoc="0" locked="0" layoutInCell="1" allowOverlap="1" wp14:anchorId="3EB698E0" wp14:editId="65436259">
                   <wp:simplePos x="0" y="0"/>
                   <wp:positionH relativeFrom="column">
                     <wp:posOffset>-25400</wp:posOffset>
@@ -497,10 +494,6 @@
         </w:tc>
       </w:tr>
       <w:tr>
-        <w:trPr>
-          <w:gridAfter w:val="1"/>
-          <w:wAfter w:w="8" w:type="dxa"/>
-        </w:trPr>
         <w:tc>
           <w:tcPr>
             <w:tcW w:w="11307" w:type="dxa"/>
@@ -563,10 +556,6 @@
         </w:tc>
       </w:tr>
       <w:tr>
-        <w:trPr>
-          <w:gridAfter w:val="1"/>
-          <w:wAfter w:w="8" w:type="dxa"/>
-        </w:trPr>
         <w:tc>
           <w:tcPr>
             <w:tcW w:w="11307" w:type="dxa"/>
@@ -602,10 +591,6 @@
         </w:tc>
       </w:tr>
       <w:tr>
-        <w:trPr>
-          <w:gridAfter w:val="1"/>
-          <w:wAfter w:w="8" w:type="dxa"/>
-        </w:trPr>
         <w:tc>
           <w:tcPr>
             <w:tcW w:w="11307" w:type="dxa"/>
@@ -634,10 +619,6 @@
         </w:tc>
       </w:tr>
       <w:tr>
-        <w:trPr>
-          <w:gridAfter w:val="1"/>
-          <w:wAfter w:w="8" w:type="dxa"/>
-        </w:trPr>
         <w:tc>
           <w:tcPr>
             <w:tcW w:w="5778" w:type="dxa"/>
@@ -752,8 +733,8 @@
       <w:tr>
         <w:tc>
           <w:tcPr>
-            <w:tcW w:w="11315" w:type="dxa"/>
-            <w:gridSpan w:val="16"/>
+            <w:tcW w:w="11307" w:type="dxa"/>
+            <w:gridSpan w:val="15"/>
           </w:tcPr>
           <w:p>
             <w:r>
@@ -794,8 +775,8 @@
         </w:tc>
         <w:tc>
           <w:tcPr>
-            <w:tcW w:w="8797" w:type="dxa"/>
-            <w:gridSpan w:val="13"/>
+            <w:tcW w:w="8789" w:type="dxa"/>
+            <w:gridSpan w:val="12"/>
           </w:tcPr>
           <w:p>
             <w:r>
@@ -833,8 +814,8 @@
         </w:tc>
         <w:tc>
           <w:tcPr>
-            <w:tcW w:w="8797" w:type="dxa"/>
-            <w:gridSpan w:val="13"/>
+            <w:tcW w:w="8789" w:type="dxa"/>
+            <w:gridSpan w:val="12"/>
           </w:tcPr>
           <w:p>
             <w:r>
@@ -872,8 +853,8 @@
         </w:tc>
         <w:tc>
           <w:tcPr>
-            <w:tcW w:w="8797" w:type="dxa"/>
-            <w:gridSpan w:val="13"/>
+            <w:tcW w:w="8789" w:type="dxa"/>
+            <w:gridSpan w:val="12"/>
           </w:tcPr>
           <w:p>
             <w:r>
@@ -909,8 +890,8 @@
         </w:tc>
         <w:tc>
           <w:tcPr>
-            <w:tcW w:w="8797" w:type="dxa"/>
-            <w:gridSpan w:val="13"/>
+            <w:tcW w:w="8789" w:type="dxa"/>
+            <w:gridSpan w:val="12"/>
           </w:tcPr>
           <w:p>
             <w:r>
@@ -946,8 +927,8 @@
         </w:tc>
         <w:tc>
           <w:tcPr>
-            <w:tcW w:w="8797" w:type="dxa"/>
-            <w:gridSpan w:val="13"/>
+            <w:tcW w:w="8789" w:type="dxa"/>
+            <w:gridSpan w:val="12"/>
           </w:tcPr>
           <w:p>
             <w:pPr>
@@ -967,8 +948,8 @@
       <w:tr>
         <w:tc>
           <w:tcPr>
-            <w:tcW w:w="11315" w:type="dxa"/>
-            <w:gridSpan w:val="16"/>
+            <w:tcW w:w="11307" w:type="dxa"/>
+            <w:gridSpan w:val="15"/>
           </w:tcPr>
           <w:p>
             <w:r>
@@ -1017,8 +998,8 @@
         </w:tc>
         <w:tc>
           <w:tcPr>
-            <w:tcW w:w="8797" w:type="dxa"/>
-            <w:gridSpan w:val="13"/>
+            <w:tcW w:w="8789" w:type="dxa"/>
+            <w:gridSpan w:val="12"/>
           </w:tcPr>
           <w:p>
             <w:r>
@@ -1142,8 +1123,8 @@
         </w:tc>
         <w:tc>
           <w:tcPr>
-            <w:tcW w:w="3550" w:type="dxa"/>
-            <w:gridSpan w:val="4"/>
+            <w:tcW w:w="3542" w:type="dxa"/>
+            <w:gridSpan w:val="3"/>
           </w:tcPr>
           <w:p>
             <w:r>
@@ -1191,8 +1172,8 @@
         </w:tc>
         <w:tc>
           <w:tcPr>
-            <w:tcW w:w="5537" w:type="dxa"/>
-            <w:gridSpan w:val="7"/>
+            <w:tcW w:w="5529" w:type="dxa"/>
+            <w:gridSpan w:val="6"/>
           </w:tcPr>
           <w:p>
             <w:pPr>
@@ -1326,8 +1307,8 @@
         </w:tc>
         <w:tc>
           <w:tcPr>
-            <w:tcW w:w="3550" w:type="dxa"/>
-            <w:gridSpan w:val="4"/>
+            <w:tcW w:w="3542" w:type="dxa"/>
+            <w:gridSpan w:val="3"/>
           </w:tcPr>
           <w:p>
             <w:r>
@@ -1423,8 +1404,8 @@
         </w:tc>
         <w:tc>
           <w:tcPr>
-            <w:tcW w:w="3550" w:type="dxa"/>
-            <w:gridSpan w:val="4"/>
+            <w:tcW w:w="3542" w:type="dxa"/>
+            <w:gridSpan w:val="3"/>
           </w:tcPr>
           <w:p>
             <w:r>
@@ -1522,8 +1503,8 @@
         </w:tc>
         <w:tc>
           <w:tcPr>
-            <w:tcW w:w="3550" w:type="dxa"/>
-            <w:gridSpan w:val="4"/>
+            <w:tcW w:w="3542" w:type="dxa"/>
+            <w:gridSpan w:val="3"/>
           </w:tcPr>
           <w:p>
             <w:r>
@@ -1617,8 +1598,8 @@
         </w:tc>
         <w:tc>
           <w:tcPr>
-            <w:tcW w:w="3550" w:type="dxa"/>
-            <w:gridSpan w:val="4"/>
+            <w:tcW w:w="3542" w:type="dxa"/>
+            <w:gridSpan w:val="3"/>
             <w:tcBorders>
               <w:bottom w:val="single" w:sz="4" w:space="0" w:color="auto"/>
             </w:tcBorders>
@@ -1712,8 +1693,8 @@
         </w:tc>
         <w:tc>
           <w:tcPr>
-            <w:tcW w:w="3550" w:type="dxa"/>
-            <w:gridSpan w:val="4"/>
+            <w:tcW w:w="3542" w:type="dxa"/>
+            <w:gridSpan w:val="3"/>
           </w:tcPr>
           <w:p>
             <w:pPr>
@@ -1759,8 +1740,8 @@
         </w:tc>
         <w:tc>
           <w:tcPr>
-            <w:tcW w:w="8797" w:type="dxa"/>
-            <w:gridSpan w:val="13"/>
+            <w:tcW w:w="8789" w:type="dxa"/>
+            <w:gridSpan w:val="12"/>
           </w:tcPr>
           <w:p>
             <w:pPr>
@@ -1779,8 +1760,6 @@
       </w:tr>
       <w:tr>
         <w:trPr>
-          <w:gridAfter w:val="1"/>
-          <w:wAfter w:w="8" w:type="dxa"/>
           <w:trHeight w:val="282"/>
         </w:trPr>
         <w:tc>
@@ -1809,8 +1788,6 @@
       </w:tr>
       <w:tr>
         <w:trPr>
-          <w:gridAfter w:val="1"/>
-          <w:wAfter w:w="8" w:type="dxa"/>
           <w:trHeight w:val="282"/>
         </w:trPr>
         <w:tc>
@@ -1881,10 +1858,6 @@
         </w:tc>
       </w:tr>
       <w:tr>
-        <w:trPr>
-          <w:gridAfter w:val="1"/>
-          <w:wAfter w:w="8" w:type="dxa"/>
-        </w:trPr>
         <w:tc>
           <w:tcPr>
             <w:tcW w:w="370" w:type="dxa"/>
@@ -1950,10 +1923,6 @@
         </w:tc>
       </w:tr>
       <w:tr>
-        <w:trPr>
-          <w:gridAfter w:val="1"/>
-          <w:wAfter w:w="8" w:type="dxa"/>
-        </w:trPr>
         <w:tc>
           <w:tcPr>
             <w:tcW w:w="370" w:type="dxa"/>
@@ -2027,10 +1996,6 @@
         </w:tc>
       </w:tr>
       <w:tr>
-        <w:trPr>
-          <w:gridAfter w:val="1"/>
-          <w:wAfter w:w="8" w:type="dxa"/>
-        </w:trPr>
         <w:tc>
           <w:tcPr>
             <w:tcW w:w="370" w:type="dxa"/>
@@ -2104,10 +2069,6 @@
         </w:tc>
       </w:tr>
       <w:tr>
-        <w:trPr>
-          <w:gridAfter w:val="1"/>
-          <w:wAfter w:w="8" w:type="dxa"/>
-        </w:trPr>
         <w:tc>
           <w:tcPr>
             <w:tcW w:w="370" w:type="dxa"/>
@@ -2181,10 +2142,6 @@
         </w:tc>
       </w:tr>
       <w:tr>
-        <w:trPr>
-          <w:gridAfter w:val="1"/>
-          <w:wAfter w:w="8" w:type="dxa"/>
-        </w:trPr>
         <w:tc>
           <w:tcPr>
             <w:tcW w:w="370" w:type="dxa"/>
@@ -2248,10 +2205,6 @@
         </w:tc>
       </w:tr>
       <w:tr>
-        <w:trPr>
-          <w:gridAfter w:val="1"/>
-          <w:wAfter w:w="8" w:type="dxa"/>
-        </w:trPr>
         <w:tc>
           <w:tcPr>
             <w:tcW w:w="11307" w:type="dxa"/>
@@ -2278,10 +2231,6 @@
         </w:tc>
       </w:tr>
       <w:tr>
-        <w:trPr>
-          <w:gridAfter w:val="1"/>
-          <w:wAfter w:w="8" w:type="dxa"/>
-        </w:trPr>
         <w:tc>
           <w:tcPr>
             <w:tcW w:w="2802" w:type="dxa"/>
@@ -2330,10 +2279,6 @@
         </w:tc>
       </w:tr>
       <w:tr>
-        <w:trPr>
-          <w:gridAfter w:val="1"/>
-          <w:wAfter w:w="8" w:type="dxa"/>
-        </w:trPr>
         <w:tc>
           <w:tcPr>
             <w:tcW w:w="2802" w:type="dxa"/>
@@ -2382,10 +2327,6 @@
         </w:tc>
       </w:tr>
       <w:tr>
-        <w:trPr>
-          <w:gridAfter w:val="1"/>
-          <w:wAfter w:w="8" w:type="dxa"/>
-        </w:trPr>
         <w:tc>
           <w:tcPr>
             <w:tcW w:w="11307" w:type="dxa"/>
@@ -2410,10 +2351,6 @@
         </w:tc>
       </w:tr>
       <w:tr>
-        <w:trPr>
-          <w:gridAfter w:val="1"/>
-          <w:wAfter w:w="8" w:type="dxa"/>
-        </w:trPr>
         <w:tc>
           <w:tcPr>
             <w:tcW w:w="11307" w:type="dxa"/>
@@ -2435,10 +2372,6 @@
         </w:tc>
       </w:tr>
       <w:tr>
-        <w:trPr>
-          <w:gridAfter w:val="1"/>
-          <w:wAfter w:w="8" w:type="dxa"/>
-        </w:trPr>
         <w:tc>
           <w:tcPr>
             <w:tcW w:w="11307" w:type="dxa"/>
@@ -2463,10 +2396,6 @@
         </w:tc>
       </w:tr>
       <w:tr>
-        <w:trPr>
-          <w:gridAfter w:val="1"/>
-          <w:wAfter w:w="8" w:type="dxa"/>
-        </w:trPr>
         <w:tc>
           <w:tcPr>
             <w:tcW w:w="11307" w:type="dxa"/>
@@ -2486,10 +2415,6 @@
         </w:tc>
       </w:tr>
       <w:tr>
-        <w:trPr>
-          <w:gridAfter w:val="1"/>
-          <w:wAfter w:w="8" w:type="dxa"/>
-        </w:trPr>
         <w:tc>
           <w:tcPr>
             <w:tcW w:w="11307" w:type="dxa"/>
@@ -2514,10 +2439,6 @@
         </w:tc>
       </w:tr>
       <w:tr>
-        <w:trPr>
-          <w:gridAfter w:val="1"/>
-          <w:wAfter w:w="8" w:type="dxa"/>
-        </w:trPr>
         <w:tc>
           <w:tcPr>
             <w:tcW w:w="11307" w:type="dxa"/>
@@ -2537,10 +2458,6 @@
         </w:tc>
       </w:tr>
       <w:tr>
-        <w:trPr>
-          <w:gridAfter w:val="1"/>
-          <w:wAfter w:w="8" w:type="dxa"/>
-        </w:trPr>
         <w:tc>
           <w:tcPr>
             <w:tcW w:w="11307" w:type="dxa"/>
@@ -2566,14 +2483,13 @@
         </w:tc>
       </w:tr>
       <w:tr>
-        <w:trPr>
-          <w:gridAfter w:val="1"/>
-          <w:wAfter w:w="8" w:type="dxa"/>
-        </w:trPr>
         <w:tc>
           <w:tcPr>
             <w:tcW w:w="11307" w:type="dxa"/>
             <w:gridSpan w:val="15"/>
+            <w:tcBorders>
+              <w:bottom w:val="single" w:sz="4" w:space="0" w:color="auto"/>
+            </w:tcBorders>
           </w:tcPr>
           <w:p>
             <w:pPr>
@@ -2599,6 +2515,9 @@
           <w:tcPr>
             <w:tcW w:w="2235" w:type="dxa"/>
             <w:gridSpan w:val="2"/>
+            <w:tcBorders>
+              <w:bottom w:val="single" w:sz="4" w:space="0" w:color="auto"/>
+            </w:tcBorders>
           </w:tcPr>
           <w:p>
             <w:pPr>
@@ -2612,6 +2531,9 @@
         <w:tc>
           <w:tcPr>
             <w:tcW w:w="283" w:type="dxa"/>
+            <w:tcBorders>
+              <w:bottom w:val="single" w:sz="4" w:space="0" w:color="auto"/>
+            </w:tcBorders>
           </w:tcPr>
           <w:p>
             <w:pPr>
@@ -2626,6 +2548,9 @@
           <w:tcPr>
             <w:tcW w:w="2977" w:type="dxa"/>
             <w:gridSpan w:val="5"/>
+            <w:tcBorders>
+              <w:bottom w:val="single" w:sz="4" w:space="0" w:color="auto"/>
+            </w:tcBorders>
           </w:tcPr>
           <w:p>
             <w:pPr>
@@ -2646,6 +2571,9 @@
           <w:tcPr>
             <w:tcW w:w="1986" w:type="dxa"/>
             <w:gridSpan w:val="3"/>
+            <w:tcBorders>
+              <w:bottom w:val="single" w:sz="4" w:space="0" w:color="auto"/>
+            </w:tcBorders>
           </w:tcPr>
           <w:p>
             <w:pPr>
@@ -2660,6 +2588,9 @@
         <w:tc>
           <w:tcPr>
             <w:tcW w:w="284" w:type="dxa"/>
+            <w:tcBorders>
+              <w:bottom w:val="single" w:sz="4" w:space="0" w:color="auto"/>
+            </w:tcBorders>
           </w:tcPr>
           <w:p>
             <w:pPr>
@@ -2672,8 +2603,11 @@
         </w:tc>
         <w:tc>
           <w:tcPr>
-            <w:tcW w:w="3550" w:type="dxa"/>
-            <w:gridSpan w:val="4"/>
+            <w:tcW w:w="3542" w:type="dxa"/>
+            <w:gridSpan w:val="3"/>
+            <w:tcBorders>
+              <w:bottom w:val="single" w:sz="4" w:space="0" w:color="auto"/>
+            </w:tcBorders>
           </w:tcPr>
           <w:p>
             <w:pPr>
@@ -2689,14 +2623,38 @@
         </w:tc>
       </w:tr>
       <w:tr>
-        <w:trPr>
-          <w:gridAfter w:val="1"/>
-          <w:wAfter w:w="8" w:type="dxa"/>
-        </w:trPr>
+        <w:tc>
+          <w:tcPr>
+            <w:tcW w:w="11307" w:type="dxa"/>
+            <w:gridSpan w:val="15"/>
+            <w:tcBorders>
+              <w:top w:val="single" w:sz="4" w:space="0" w:color="auto"/>
+              <w:left w:val="nil"/>
+              <w:bottom w:val="nil"/>
+              <w:right w:val="nil"/>
+            </w:tcBorders>
+          </w:tcPr>
+          <w:p>
+            <w:pPr>
+              <w:keepNext/>
+              <w:rPr>
+                <w:sz w:val="17"/>
+              </w:rPr>
+            </w:pPr>
+          </w:p>
+        </w:tc>
+      </w:tr>
+      <w:tr>
         <w:tc>
           <w:tcPr>
             <w:tcW w:w="5778" w:type="dxa"/>
             <w:gridSpan w:val="9"/>
+            <w:tcBorders>
+              <w:top w:val="nil"/>
+              <w:left w:val="nil"/>
+              <w:bottom w:val="nil"/>
+              <w:right w:val="nil"/>
+            </w:tcBorders>
           </w:tcPr>
           <w:p>
             <w:pPr>
@@ -2708,6 +2666,12 @@
           <w:tcPr>
             <w:tcW w:w="5529" w:type="dxa"/>
             <w:gridSpan w:val="6"/>
+            <w:tcBorders>
+              <w:top w:val="nil"/>
+              <w:left w:val="nil"/>
+              <w:bottom w:val="nil"/>
+              <w:right w:val="nil"/>
+            </w:tcBorders>
           </w:tcPr>
           <w:p>
             <w:pPr>
@@ -2718,6 +2682,20 @@
                 <w:bCs/>
               </w:rPr>
             </w:pPr>
+            <w:proofErr w:type="spellStart"/>
+            <w:r>
+              <w:rPr>
+                <w:sz w:val="17"/>
+              </w:rPr>
+              <w:t>Sukoharjo</w:t>
+            </w:r>
+            <w:proofErr w:type="spellEnd"/>
+            <w:r>
+              <w:rPr>
+                <w:sz w:val="17"/>
+              </w:rPr>
+              <w:t xml:space="preserve">, </w:t>
+            </w:r>
             <w:r>
               <w:rPr>
                 <w:sz w:val="17"/>
@@ -2737,26 +2715,6 @@
                 <w:lang w:val="en-ID"/>
               </w:rPr>
               <w:t>_TANGGAL</w:t>
-            </w:r>
-            <w:r>
-              <w:rPr>
-                <w:sz w:val="17"/>
-              </w:rPr>
-              <w:t>} ${</w:t>
-            </w:r>
-            <w:r>
-              <w:rPr>
-                <w:sz w:val="17"/>
-                <w:lang w:val="en-ID"/>
-              </w:rPr>
-              <w:t>FINALISASI</w:t>
-            </w:r>
-            <w:r>
-              <w:rPr>
-                <w:sz w:val="17"/>
-                <w:lang w:val="en-ID"/>
-              </w:rPr>
-              <w:t>_JAM</w:t>
             </w:r>
             <w:r>
               <w:rPr>
@@ -2782,7 +2740,7 @@
               <mc:AlternateContent>
                 <mc:Choice Requires="wps">
                   <w:drawing>
-                    <wp:anchor distT="0" distB="0" distL="114300" distR="114300" simplePos="0" relativeHeight="251656704" behindDoc="0" locked="0" layoutInCell="1" allowOverlap="1" wp14:anchorId="1B7476A5" wp14:editId="47300360">
+                    <wp:anchor distT="0" distB="0" distL="114300" distR="114300" simplePos="0" relativeHeight="251657728" behindDoc="0" locked="0" layoutInCell="1" allowOverlap="1" wp14:anchorId="1B7476A5" wp14:editId="47300360">
                       <wp:simplePos x="0" y="0"/>
                       <wp:positionH relativeFrom="column">
                         <wp:posOffset>508000</wp:posOffset>
@@ -2860,7 +2818,7 @@
                       <v:stroke joinstyle="miter"/>
                       <v:path gradientshapeok="t" o:connecttype="rect"/>
                     </v:shapetype>
-                    <v:shape id="Text Box 7" o:spid="_x0000_s1026" type="#_x0000_t202" style="position:absolute;left:0;text-align:left;margin-left:40pt;margin-top:10.05pt;width:188.15pt;height:91.85pt;z-index:251656704;visibility:visible;mso-wrap-style:square;mso-width-percent:0;mso-height-percent:0;mso-wrap-distance-left:9pt;mso-wrap-distance-top:0;mso-wrap-distance-right:9pt;mso-wrap-distance-bottom:0;mso-position-horizontal:absolute;mso-position-horizontal-relative:text;mso-position-vertical:absolute;mso-position-vertical-relative:text;mso-width-percent:0;mso-height-percent:0;mso-width-relative:margin;mso-height-relative:margin;v-text-anchor:middle" o:gfxdata="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" filled="f" stroked="f" strokeweight=".5pt">
+                    <v:shape id="Text Box 7" o:spid="_x0000_s1026" type="#_x0000_t202" style="position:absolute;left:0;text-align:left;margin-left:40pt;margin-top:10.05pt;width:188.15pt;height:91.85pt;z-index:251657728;visibility:visible;mso-wrap-style:square;mso-width-percent:0;mso-height-percent:0;mso-wrap-distance-left:9pt;mso-wrap-distance-top:0;mso-wrap-distance-right:9pt;mso-wrap-distance-bottom:0;mso-position-horizontal:absolute;mso-position-horizontal-relative:text;mso-position-vertical:absolute;mso-position-vertical-relative:text;mso-width-percent:0;mso-height-percent:0;mso-width-relative:margin;mso-height-relative:margin;v-text-anchor:middle" o:gfxdata="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" filled="f" stroked="f" strokeweight=".5pt">
                       <v:textbox>
                         <w:txbxContent>
                           <w:p>

</xml_diff>